<commit_message>
feat(P1): §3.12 Agent Settings PR 3, the client's "Your advisor" card
Screen-Inventory §3.12 Q11 and Q14: clients now see their advisor as
the advisor set themselves up.

- client_advisor_card(): the signed-in client's own advisor, client-
  facing fields only (no email, phone, hours or time-away label), plus
  awayUntil (the first day back) while a time-away block runs. Also the
  contract the Android PR reads.
- Dashboard "Your advisor" card: photo, name, pronouns, reply-time
  promise or "Away until…", a 3-line bio and the links.
- Conversation headers (inbox thread and trip thread) and the new-
  message form: the photo and the promise or "Away until…".
- A failed read keeps the long-standing fixed words.

Co-Authored-By: Claude Opus 5.5 <noreply@anthropic.com>
</commit_message>
<xml_diff>
--- a/docs/Screen-Inventory.docx
+++ b/docs/Screen-Inventory.docx
@@ -54419,6 +54419,180 @@
       </w:r>
       <w:r>
         <w:t xml:space="preserve">the dialog even while it is off. A running block’s reply cannot be edited (only ended early).</w:t>
+      </w:r>
+    </w:p>
+    <w:p>
+      <w:pPr>
+        <w:pStyle w:val="Compact"/>
+        <w:numPr>
+          <w:ilvl w:val="0"/>
+          <w:numId w:val="1018"/>
+        </w:numPr>
+      </w:pPr>
+      <w:r>
+        <w:rPr>
+          <w:b/>
+          <w:bCs/>
+        </w:rPr>
+        <w:t xml:space="preserve">The auto-reply’s default words</w:t>
+      </w:r>
+      <w:r>
+        <w:t xml:space="preserve"> </w:t>
+      </w:r>
+      <w:r>
+        <w:t xml:space="preserve">came out of the brand-voice review as</w:t>
+      </w:r>
+      <w:r>
+        <w:t xml:space="preserve"> </w:t>
+      </w:r>
+      <w:r>
+        <w:t xml:space="preserve">“…Your plans are</w:t>
+      </w:r>
+      <w:r>
+        <w:t xml:space="preserve"> </w:t>
+      </w:r>
+      <w:r>
+        <w:t xml:space="preserve">in good hands.”</w:t>
+      </w:r>
+      <w:r>
+        <w:t xml:space="preserve"> </w:t>
+      </w:r>
+      <w:r>
+        <w:t xml:space="preserve">(not</w:t>
+      </w:r>
+      <w:r>
+        <w:t xml:space="preserve"> </w:t>
+      </w:r>
+      <w:r>
+        <w:t xml:space="preserve">“Your trip”</w:t>
+      </w:r>
+      <w:r>
+        <w:t xml:space="preserve">: a new inquiry has no trip yet).</w:t>
+      </w:r>
+    </w:p>
+    <w:p>
+      <w:pPr>
+        <w:pStyle w:val="Compact"/>
+        <w:numPr>
+          <w:ilvl w:val="0"/>
+          <w:numId w:val="1018"/>
+        </w:numPr>
+      </w:pPr>
+      <w:r>
+        <w:rPr>
+          <w:b/>
+          <w:bCs/>
+        </w:rPr>
+        <w:t xml:space="preserve">PR 3, the client’s</w:t>
+      </w:r>
+      <w:r>
+        <w:rPr>
+          <w:b/>
+          <w:bCs/>
+        </w:rPr>
+        <w:t xml:space="preserve"> </w:t>
+      </w:r>
+      <w:r>
+        <w:rPr>
+          <w:b/>
+          <w:bCs/>
+        </w:rPr>
+        <w:t xml:space="preserve">“Your advisor”</w:t>
+      </w:r>
+      <w:r>
+        <w:rPr>
+          <w:b/>
+          <w:bCs/>
+        </w:rPr>
+        <w:t xml:space="preserve"> </w:t>
+      </w:r>
+      <w:r>
+        <w:rPr>
+          <w:b/>
+          <w:bCs/>
+        </w:rPr>
+        <w:t xml:space="preserve">card</w:t>
+      </w:r>
+      <w:r>
+        <w:t xml:space="preserve"> </w:t>
+      </w:r>
+      <w:r>
+        <w:t xml:space="preserve">reads</w:t>
+      </w:r>
+      <w:r>
+        <w:t xml:space="preserve"> </w:t>
+      </w:r>
+      <w:r>
+        <w:rPr>
+          <w:rStyle w:val="VerbatimChar"/>
+        </w:rPr>
+        <w:t xml:space="preserve">client_advisor_card()</w:t>
+      </w:r>
+      <w:r>
+        <w:t xml:space="preserve">: only the</w:t>
+      </w:r>
+      <w:r>
+        <w:t xml:space="preserve"> </w:t>
+      </w:r>
+      <w:r>
+        <w:t xml:space="preserve">client-facing fields (no email, phone, hours or time-away label). The dashboard card shows</w:t>
+      </w:r>
+      <w:r>
+        <w:t xml:space="preserve"> </w:t>
+      </w:r>
+      <w:r>
+        <w:t xml:space="preserve">photo, name, pronouns, the reply-time promise, a 3-line bio and the links; the conversation</w:t>
+      </w:r>
+      <w:r>
+        <w:t xml:space="preserve"> </w:t>
+      </w:r>
+      <w:r>
+        <w:t xml:space="preserve">headers and the new-message form show the photo and the promise. While a block runs every</w:t>
+      </w:r>
+      <w:r>
+        <w:t xml:space="preserve"> </w:t>
+      </w:r>
+      <w:r>
+        <w:t xml:space="preserve">one says</w:t>
+      </w:r>
+      <w:r>
+        <w:t xml:space="preserve"> </w:t>
+      </w:r>
+      <w:r>
+        <w:t xml:space="preserve">“Away until Tuesday, October 20”</w:t>
+      </w:r>
+      <w:r>
+        <w:t xml:space="preserve"> </w:t>
+      </w:r>
+      <w:r>
+        <w:t xml:space="preserve">(the first day back). 24 and 48 hours read as</w:t>
+      </w:r>
+      <w:r>
+        <w:t xml:space="preserve"> </w:t>
+      </w:r>
+      <w:r>
+        <w:t xml:space="preserve">“a</w:t>
+      </w:r>
+      <w:r>
+        <w:t xml:space="preserve"> </w:t>
+      </w:r>
+      <w:r>
+        <w:t xml:space="preserve">day”</w:t>
+      </w:r>
+      <w:r>
+        <w:t xml:space="preserve"> </w:t>
+      </w:r>
+      <w:r>
+        <w:t xml:space="preserve">and</w:t>
+      </w:r>
+      <w:r>
+        <w:t xml:space="preserve"> </w:t>
+      </w:r>
+      <w:r>
+        <w:t xml:space="preserve">“2 days”</w:t>
+      </w:r>
+      <w:r>
+        <w:t xml:space="preserve">. A failed read keeps the old fixed words rather than an empty card.</w:t>
       </w:r>
     </w:p>
     <w:p>

</xml_diff>

<commit_message>
docs(P1): §3.11 Reporting rulings (grilled 2026-10-21)
Screen Inventory §3.11 gets the "Ruled 2026-10-21" block: P1, web only, last
agent section before release; hand-drawn charts with a table under each; one
period filter; stage dates from trip_status_history with no backfill; YoY only
once there is a last year; per-report CSV export, audited; the seven-tile hub;
each report's definition; the Export Center as CSV on demand with history read
from audit rows. Three PRs follow.

Data-Model §6.1 drops client.lifetime_value_cents, which nothing ever wrote.
§3.10 records Gyasi's confirmation of the one-business-day edge cases.

Co-Authored-By: Claude Opus 5.5 <noreply@anthropic.com>
</commit_message>
<xml_diff>
--- a/docs/Screen-Inventory.docx
+++ b/docs/Screen-Inventory.docx
@@ -48886,7 +48886,19 @@
         <w:t xml:space="preserve"> </w:t>
       </w:r>
       <w:r>
-        <w:t xml:space="preserve">advisor’s zone. An internal note does not answer anyone.</w:t>
+        <w:t xml:space="preserve">advisor’s zone. An internal note does not answer anyone. (Gyasi confirmed the edge cases on</w:t>
+      </w:r>
+      <w:r>
+        <w:t xml:space="preserve"> </w:t>
+      </w:r>
+      <w:r>
+        <w:t xml:space="preserve">2026-10-21: a Monday 12:05 AM message is due at the end of Tuesday, about 48 hours, and an</w:t>
+      </w:r>
+      <w:r>
+        <w:t xml:space="preserve"> </w:t>
+      </w:r>
+      <w:r>
+        <w:t xml:space="preserve">11:55 PM one about 24 hours.)</w:t>
       </w:r>
     </w:p>
     <w:p>
@@ -52436,6 +52448,1166 @@
       </w:pPr>
       <w:r>
         <w:t xml:space="preserve">3.11 Reporting</w:t>
+      </w:r>
+    </w:p>
+    <w:p>
+      <w:pPr>
+        <w:pStyle w:val="BlockText"/>
+      </w:pPr>
+      <w:r>
+        <w:rPr>
+          <w:b/>
+          <w:bCs/>
+        </w:rPr>
+        <w:t xml:space="preserve">Ruled 2026-10-21 (grilled with Gyasi,</w:t>
+      </w:r>
+      <w:r>
+        <w:rPr>
+          <w:b/>
+          <w:bCs/>
+        </w:rPr>
+        <w:t xml:space="preserve"> </w:t>
+      </w:r>
+      <w:r>
+        <w:rPr>
+          <w:b/>
+          <w:bCs/>
+        </w:rPr>
+        <w:t xml:space="preserve">“yes”</w:t>
+      </w:r>
+      <w:r>
+        <w:rPr>
+          <w:b/>
+          <w:bCs/>
+        </w:rPr>
+        <w:t xml:space="preserve"> </w:t>
+      </w:r>
+      <w:r>
+        <w:rPr>
+          <w:b/>
+          <w:bCs/>
+        </w:rPr>
+        <w:t xml:space="preserve">to every recommendation, Q1 to Q17).</w:t>
+      </w:r>
+      <w:r>
+        <w:t xml:space="preserve"> </w:t>
+      </w:r>
+      <w:r>
+        <w:t xml:space="preserve">P1, and</w:t>
+      </w:r>
+      <w:r>
+        <w:t xml:space="preserve"> </w:t>
+      </w:r>
+      <w:r>
+        <w:t xml:space="preserve">the last agent section before the production release (group trips excepted).</w:t>
+      </w:r>
+      <w:r>
+        <w:t xml:space="preserve"> </w:t>
+      </w:r>
+      <w:r>
+        <w:rPr>
+          <w:b/>
+          <w:bCs/>
+        </w:rPr>
+        <w:t xml:space="preserve">Web only:</w:t>
+      </w:r>
+      <w:r>
+        <w:t xml:space="preserve"> </w:t>
+      </w:r>
+      <w:r>
+        <w:t xml:space="preserve">the phone gets no Reports door, which supersedes the</w:t>
+      </w:r>
+      <w:r>
+        <w:t xml:space="preserve"> </w:t>
+      </w:r>
+      <w:r>
+        <w:t xml:space="preserve">“summary KPIs”</w:t>
+      </w:r>
+      <w:r>
+        <w:t xml:space="preserve"> </w:t>
+      </w:r>
+      <w:r>
+        <w:t xml:space="preserve">mobile rows in §4.4 and</w:t>
+      </w:r>
+      <w:r>
+        <w:t xml:space="preserve"> </w:t>
+      </w:r>
+      <w:r>
+        <w:t xml:space="preserve">the responsive table for 3.11. Shipped in three PRs after these docs:</w:t>
+      </w:r>
+      <w:r>
+        <w:t xml:space="preserve"> </w:t>
+      </w:r>
+      <w:r>
+        <w:rPr>
+          <w:b/>
+          <w:bCs/>
+        </w:rPr>
+        <w:t xml:space="preserve">PR 1</w:t>
+      </w:r>
+      <w:r>
+        <w:t xml:space="preserve"> </w:t>
+      </w:r>
+      <w:r>
+        <w:t xml:space="preserve">the hub,</w:t>
+      </w:r>
+      <w:r>
+        <w:t xml:space="preserve"> </w:t>
+      </w:r>
+      <w:r>
+        <w:t xml:space="preserve">Revenue by Month, Commission by Supplier and Top Destinations;</w:t>
+      </w:r>
+      <w:r>
+        <w:t xml:space="preserve"> </w:t>
+      </w:r>
+      <w:r>
+        <w:rPr>
+          <w:b/>
+          <w:bCs/>
+        </w:rPr>
+        <w:t xml:space="preserve">PR 2</w:t>
+      </w:r>
+      <w:r>
+        <w:t xml:space="preserve"> </w:t>
+      </w:r>
+      <w:r>
+        <w:t xml:space="preserve">Client Lifetime</w:t>
+      </w:r>
+      <w:r>
+        <w:t xml:space="preserve"> </w:t>
+      </w:r>
+      <w:r>
+        <w:t xml:space="preserve">Value, the Funnel and Pipeline Value (Pipeline drawn as a local artboard first);</w:t>
+      </w:r>
+      <w:r>
+        <w:t xml:space="preserve"> </w:t>
+      </w:r>
+      <w:r>
+        <w:rPr>
+          <w:b/>
+          <w:bCs/>
+        </w:rPr>
+        <w:t xml:space="preserve">PR 3</w:t>
+      </w:r>
+      <w:r>
+        <w:t xml:space="preserve"> </w:t>
+      </w:r>
+      <w:r>
+        <w:t xml:space="preserve">the Export Center.</w:t>
+      </w:r>
+    </w:p>
+    <w:p>
+      <w:pPr>
+        <w:pStyle w:val="BlockText"/>
+      </w:pPr>
+      <w:r>
+        <w:rPr>
+          <w:b/>
+          <w:bCs/>
+        </w:rPr>
+        <w:t xml:space="preserve">Shared rules.</w:t>
+      </w:r>
+      <w:r>
+        <w:t xml:space="preserve"> </w:t>
+      </w:r>
+      <w:r>
+        <w:t xml:space="preserve">-</w:t>
+      </w:r>
+      <w:r>
+        <w:t xml:space="preserve"> </w:t>
+      </w:r>
+      <w:r>
+        <w:rPr>
+          <w:b/>
+          <w:bCs/>
+        </w:rPr>
+        <w:t xml:space="preserve">Charts are drawn by hand</w:t>
+      </w:r>
+      <w:r>
+        <w:t xml:space="preserve"> </w:t>
+      </w:r>
+      <w:r>
+        <w:t xml:space="preserve">(MUI boxes and SVG), the way</w:t>
+      </w:r>
+      <w:r>
+        <w:t xml:space="preserve"> </w:t>
+      </w:r>
+      <w:r>
+        <w:rPr>
+          <w:rStyle w:val="VerbatimChar"/>
+        </w:rPr>
+        <w:t xml:space="preserve">CommissionTrendChart</w:t>
+      </w:r>
+      <w:r>
+        <w:t xml:space="preserve"> </w:t>
+      </w:r>
+      <w:r>
+        <w:t xml:space="preserve">already</w:t>
+      </w:r>
+      <w:r>
+        <w:t xml:space="preserve"> </w:t>
+      </w:r>
+      <w:r>
+        <w:t xml:space="preserve">is: no chart library. Every chart has a plain table of the same figures under it, which</w:t>
+      </w:r>
+      <w:r>
+        <w:t xml:space="preserve"> </w:t>
+      </w:r>
+      <w:r>
+        <w:t xml:space="preserve">is also what a screen reader and the CSV read.</w:t>
+      </w:r>
+      <w:r>
+        <w:t xml:space="preserve"> </w:t>
+      </w:r>
+      <w:r>
+        <w:t xml:space="preserve">-</w:t>
+      </w:r>
+      <w:r>
+        <w:t xml:space="preserve"> </w:t>
+      </w:r>
+      <w:r>
+        <w:rPr>
+          <w:b/>
+          <w:bCs/>
+        </w:rPr>
+        <w:t xml:space="preserve">One period filter on every report:</w:t>
+      </w:r>
+      <w:r>
+        <w:t xml:space="preserve"> </w:t>
+      </w:r>
+      <w:r>
+        <w:t xml:space="preserve">chips for</w:t>
+      </w:r>
+      <w:r>
+        <w:t xml:space="preserve"> </w:t>
+      </w:r>
+      <w:r>
+        <w:rPr>
+          <w:i/>
+          <w:iCs/>
+        </w:rPr>
+        <w:t xml:space="preserve">Year to date</w:t>
+      </w:r>
+      <w:r>
+        <w:t xml:space="preserve">,</w:t>
+      </w:r>
+      <w:r>
+        <w:t xml:space="preserve"> </w:t>
+      </w:r>
+      <w:r>
+        <w:rPr>
+          <w:i/>
+          <w:iCs/>
+        </w:rPr>
+        <w:t xml:space="preserve">Last 12 months</w:t>
+      </w:r>
+      <w:r>
+        <w:t xml:space="preserve"> </w:t>
+      </w:r>
+      <w:r>
+        <w:t xml:space="preserve">and</w:t>
+      </w:r>
+      <w:r>
+        <w:t xml:space="preserve"> </w:t>
+      </w:r>
+      <w:r>
+        <w:rPr>
+          <w:i/>
+          <w:iCs/>
+        </w:rPr>
+        <w:t xml:space="preserve">This quarter</w:t>
+      </w:r>
+      <w:r>
+        <w:t xml:space="preserve">. Calendar years, in the advisor’s own time zone. No custom date range</w:t>
+      </w:r>
+      <w:r>
+        <w:t xml:space="preserve"> </w:t>
+      </w:r>
+      <w:r>
+        <w:t xml:space="preserve">except in the Export Center.</w:t>
+      </w:r>
+      <w:r>
+        <w:t xml:space="preserve"> </w:t>
+      </w:r>
+      <w:r>
+        <w:t xml:space="preserve">-</w:t>
+      </w:r>
+      <w:r>
+        <w:t xml:space="preserve"> </w:t>
+      </w:r>
+      <w:r>
+        <w:rPr>
+          <w:b/>
+          <w:bCs/>
+        </w:rPr>
+        <w:t xml:space="preserve">Stage dates come from</w:t>
+      </w:r>
+      <w:r>
+        <w:rPr>
+          <w:b/>
+          <w:bCs/>
+        </w:rPr>
+        <w:t xml:space="preserve"> </w:t>
+      </w:r>
+      <w:r>
+        <w:rPr>
+          <w:rStyle w:val="VerbatimChar"/>
+          <w:b/>
+          <w:bCs/>
+        </w:rPr>
+        <w:t xml:space="preserve">trip_status_history</w:t>
+      </w:r>
+      <w:r>
+        <w:rPr>
+          <w:b/>
+          <w:bCs/>
+        </w:rPr>
+        <w:t xml:space="preserve"> </w:t>
+      </w:r>
+      <w:r>
+        <w:rPr>
+          <w:b/>
+          <w:bCs/>
+        </w:rPr>
+        <w:t xml:space="preserve">only.</w:t>
+      </w:r>
+      <w:r>
+        <w:t xml:space="preserve"> </w:t>
+      </w:r>
+      <w:r>
+        <w:t xml:space="preserve">It has no backfill: a trip that</w:t>
+      </w:r>
+      <w:r>
+        <w:t xml:space="preserve"> </w:t>
+      </w:r>
+      <w:r>
+        <w:t xml:space="preserve">changed stage before 2026-09-19 has no date for that change, and none is made up. Reports</w:t>
+      </w:r>
+      <w:r>
+        <w:t xml:space="preserve"> </w:t>
+      </w:r>
+      <w:r>
+        <w:t xml:space="preserve">that read stage dates carry one quiet line:</w:t>
+      </w:r>
+      <w:r>
+        <w:t xml:space="preserve"> </w:t>
+      </w:r>
+      <w:r>
+        <w:t xml:space="preserve">“Tracking began Sep 19, 2026.”</w:t>
+      </w:r>
+      <w:r>
+        <w:t xml:space="preserve"> </w:t>
+      </w:r>
+      <w:r>
+        <w:t xml:space="preserve">-</w:t>
+      </w:r>
+      <w:r>
+        <w:t xml:space="preserve"> </w:t>
+      </w:r>
+      <w:r>
+        <w:rPr>
+          <w:b/>
+          <w:bCs/>
+        </w:rPr>
+        <w:t xml:space="preserve">Year over year appears only once there is a last year.</w:t>
+      </w:r>
+      <w:r>
+        <w:t xml:space="preserve"> </w:t>
+      </w:r>
+      <w:r>
+        <w:t xml:space="preserve">The YoY toggle and any</w:t>
+      </w:r>
+      <w:r>
+        <w:t xml:space="preserve"> </w:t>
+      </w:r>
+      <w:r>
+        <w:t xml:space="preserve">“vs last</w:t>
+      </w:r>
+      <w:r>
+        <w:t xml:space="preserve"> </w:t>
+      </w:r>
+      <w:r>
+        <w:t xml:space="preserve">year”</w:t>
+      </w:r>
+      <w:r>
+        <w:t xml:space="preserve"> </w:t>
+      </w:r>
+      <w:r>
+        <w:t xml:space="preserve">chip stay hidden until a prior-year month in the period has data. A number-shaped</w:t>
+      </w:r>
+      <w:r>
+        <w:t xml:space="preserve"> </w:t>
+      </w:r>
+      <w:r>
+        <w:t xml:space="preserve">hole reads as a broken number (the same rule as §3.2.1’s dropped deltas).</w:t>
+      </w:r>
+      <w:r>
+        <w:t xml:space="preserve"> </w:t>
+      </w:r>
+      <w:r>
+        <w:t xml:space="preserve">-</w:t>
+      </w:r>
+      <w:r>
+        <w:t xml:space="preserve"> </w:t>
+      </w:r>
+      <w:r>
+        <w:rPr>
+          <w:b/>
+          <w:bCs/>
+        </w:rPr>
+        <w:t xml:space="preserve">Every report’s Export downloads that report’s own table as CSV</w:t>
+      </w:r>
+      <w:r>
+        <w:t xml:space="preserve">, for the period on</w:t>
+      </w:r>
+      <w:r>
+        <w:t xml:space="preserve"> </w:t>
+      </w:r>
+      <w:r>
+        <w:t xml:space="preserve">screen, and writes an</w:t>
+      </w:r>
+      <w:r>
+        <w:t xml:space="preserve"> </w:t>
+      </w:r>
+      <w:r>
+        <w:rPr>
+          <w:rStyle w:val="VerbatimChar"/>
+        </w:rPr>
+        <w:t xml:space="preserve">audit_event</w:t>
+      </w:r>
+      <w:r>
+        <w:t xml:space="preserve"> </w:t>
+      </w:r>
+      <w:r>
+        <w:t xml:space="preserve">row. It does not jump to the Export Center.</w:t>
+      </w:r>
+      <w:r>
+        <w:t xml:space="preserve"> </w:t>
+      </w:r>
+      <w:r>
+        <w:t xml:space="preserve">-</w:t>
+      </w:r>
+      <w:r>
+        <w:t xml:space="preserve"> </w:t>
+      </w:r>
+      <w:r>
+        <w:rPr>
+          <w:b/>
+          <w:bCs/>
+        </w:rPr>
+        <w:t xml:space="preserve">Trip-grain reports count the advisor’s own trips, not archived ones</w:t>
+      </w:r>
+      <w:r>
+        <w:t xml:space="preserve">; the</w:t>
+      </w:r>
+      <w:r>
+        <w:t xml:space="preserve"> </w:t>
+      </w:r>
+      <w:r>
+        <w:t xml:space="preserve">ledger-grain ones follow the ledger. Money is USD only (BRD §3), so no report scopes or</w:t>
+      </w:r>
+      <w:r>
+        <w:t xml:space="preserve"> </w:t>
+      </w:r>
+      <w:r>
+        <w:t xml:space="preserve">labels by currency beyond the one code.</w:t>
+      </w:r>
+    </w:p>
+    <w:p>
+      <w:pPr>
+        <w:pStyle w:val="BlockText"/>
+      </w:pPr>
+      <w:r>
+        <w:rPr>
+          <w:b/>
+          <w:bCs/>
+        </w:rPr>
+        <w:t xml:space="preserve">3.11.1 Hub.</w:t>
+      </w:r>
+      <w:r>
+        <w:t xml:space="preserve"> </w:t>
+      </w:r>
+      <w:r>
+        <w:t xml:space="preserve">A grid of seven tiles: the six reports and the Export Center.</w:t>
+      </w:r>
+      <w:r>
+        <w:t xml:space="preserve"> </w:t>
+      </w:r>
+      <w:r>
+        <w:rPr>
+          <w:b/>
+          <w:bCs/>
+        </w:rPr>
+        <w:t xml:space="preserve">No</w:t>
+      </w:r>
+      <w:r>
+        <w:rPr>
+          <w:b/>
+          <w:bCs/>
+        </w:rPr>
+        <w:t xml:space="preserve"> </w:t>
+      </w:r>
+      <w:r>
+        <w:rPr>
+          <w:b/>
+          <w:bCs/>
+        </w:rPr>
+        <w:t xml:space="preserve">favorites and no recent list</w:t>
+      </w:r>
+      <w:r>
+        <w:t xml:space="preserve"> </w:t>
+      </w:r>
+      <w:r>
+        <w:t xml:space="preserve">(one advisor, seven tiles; a table to star them is not worth</w:t>
+      </w:r>
+      <w:r>
+        <w:t xml:space="preserve"> </w:t>
+      </w:r>
+      <w:r>
+        <w:t xml:space="preserve">it). The artboard’s seventh</w:t>
+      </w:r>
+      <w:r>
+        <w:t xml:space="preserve"> </w:t>
+      </w:r>
+      <w:r>
+        <w:t xml:space="preserve">“Time-to-book”</w:t>
+      </w:r>
+      <w:r>
+        <w:t xml:space="preserve"> </w:t>
+      </w:r>
+      <w:r>
+        <w:t xml:space="preserve">tile has no screen of its own: average days to</w:t>
+      </w:r>
+      <w:r>
+        <w:t xml:space="preserve"> </w:t>
+      </w:r>
+      <w:r>
+        <w:t xml:space="preserve">book is a figure on the Funnel (3.11.6). The nav rail’s Reports item goes live.</w:t>
+      </w:r>
+    </w:p>
+    <w:p>
+      <w:pPr>
+        <w:pStyle w:val="BlockText"/>
+      </w:pPr>
+      <w:r>
+        <w:rPr>
+          <w:b/>
+          <w:bCs/>
+        </w:rPr>
+        <w:t xml:space="preserve">3.11.2 Revenue by Month.</w:t>
+      </w:r>
+      <w:r>
+        <w:t xml:space="preserve"> </w:t>
+      </w:r>
+      <w:r>
+        <w:t xml:space="preserve">Story-Tail never charges clients, so its own income is</w:t>
+      </w:r>
+      <w:r>
+        <w:t xml:space="preserve"> </w:t>
+      </w:r>
+      <w:r>
+        <w:t xml:space="preserve">commission. The report has a two-way toggle:</w:t>
+      </w:r>
+      <w:r>
+        <w:t xml:space="preserve"> </w:t>
+      </w:r>
+      <w:r>
+        <w:rPr>
+          <w:b/>
+          <w:bCs/>
+        </w:rPr>
+        <w:t xml:space="preserve">Booked value</w:t>
+      </w:r>
+      <w:r>
+        <w:t xml:space="preserve"> </w:t>
+      </w:r>
+      <w:r>
+        <w:t xml:space="preserve">(default), the gross value of</w:t>
+      </w:r>
+      <w:r>
+        <w:t xml:space="preserve"> </w:t>
+      </w:r>
+      <w:r>
+        <w:t xml:space="preserve">trips by the month they were FIRST booked (a trip that goes booked, back, and booked again</w:t>
+      </w:r>
+      <w:r>
+        <w:t xml:space="preserve"> </w:t>
+      </w:r>
+      <w:r>
+        <w:t xml:space="preserve">counts once, in its first month); and</w:t>
+      </w:r>
+      <w:r>
+        <w:t xml:space="preserve"> </w:t>
+      </w:r>
+      <w:r>
+        <w:rPr>
+          <w:b/>
+          <w:bCs/>
+        </w:rPr>
+        <w:t xml:space="preserve">Commission received</w:t>
+      </w:r>
+      <w:r>
+        <w:t xml:space="preserve">, ledger money by the month it</w:t>
+      </w:r>
+      <w:r>
+        <w:t xml:space="preserve"> </w:t>
+      </w:r>
+      <w:r>
+        <w:t xml:space="preserve">arrived (</w:t>
+      </w:r>
+      <w:r>
+        <w:rPr>
+          <w:rStyle w:val="VerbatimChar"/>
+        </w:rPr>
+        <w:t xml:space="preserve">commission.received_at</w:t>
+      </w:r>
+      <w:r>
+        <w:t xml:space="preserve">), which is the tax-prep figure. Bars per month for the</w:t>
+      </w:r>
+      <w:r>
+        <w:t xml:space="preserve"> </w:t>
+      </w:r>
+      <w:r>
+        <w:t xml:space="preserve">period, a total, and the table under it.</w:t>
+      </w:r>
+    </w:p>
+    <w:p>
+      <w:pPr>
+        <w:pStyle w:val="BlockText"/>
+      </w:pPr>
+      <w:r>
+        <w:rPr>
+          <w:b/>
+          <w:bCs/>
+        </w:rPr>
+        <w:t xml:space="preserve">3.11.3 Commission by Supplier.</w:t>
+      </w:r>
+      <w:r>
+        <w:t xml:space="preserve"> </w:t>
+      </w:r>
+      <w:r>
+        <w:t xml:space="preserve">Reads the stored</w:t>
+      </w:r>
+      <w:r>
+        <w:t xml:space="preserve"> </w:t>
+      </w:r>
+      <w:r>
+        <w:rPr>
+          <w:b/>
+          <w:bCs/>
+        </w:rPr>
+        <w:t xml:space="preserve">ledger</w:t>
+      </w:r>
+      <w:r>
+        <w:t xml:space="preserve">, never the forecast. The</w:t>
+      </w:r>
+      <w:r>
+        <w:t xml:space="preserve"> </w:t>
+      </w:r>
+      <w:r>
+        <w:t xml:space="preserve">period filters on travel dates, the same as the ledger screen and its export. Each supplier</w:t>
+      </w:r>
+      <w:r>
+        <w:t xml:space="preserve"> </w:t>
+      </w:r>
+      <w:r>
+        <w:t xml:space="preserve">row shows</w:t>
+      </w:r>
+      <w:r>
+        <w:t xml:space="preserve"> </w:t>
+      </w:r>
+      <w:r>
+        <w:rPr>
+          <w:b/>
+          <w:bCs/>
+        </w:rPr>
+        <w:t xml:space="preserve">Received</w:t>
+      </w:r>
+      <w:r>
+        <w:t xml:space="preserve"> </w:t>
+      </w:r>
+      <w:r>
+        <w:t xml:space="preserve">and</w:t>
+      </w:r>
+      <w:r>
+        <w:t xml:space="preserve"> </w:t>
+      </w:r>
+      <w:r>
+        <w:rPr>
+          <w:b/>
+          <w:bCs/>
+        </w:rPr>
+        <w:t xml:space="preserve">Still owed</w:t>
+      </w:r>
+      <w:r>
+        <w:t xml:space="preserve"> </w:t>
+      </w:r>
+      <w:r>
+        <w:t xml:space="preserve">(expected plus invoiced) with a bar. Disputed and</w:t>
+      </w:r>
+      <w:r>
+        <w:t xml:space="preserve"> </w:t>
+      </w:r>
+      <w:r>
+        <w:t xml:space="preserve">lost lines are left out and counted in a footnote. A row opens the ledger filtered to that</w:t>
+      </w:r>
+      <w:r>
+        <w:t xml:space="preserve"> </w:t>
+      </w:r>
+      <w:r>
+        <w:t xml:space="preserve">supplier. Removed lines (</w:t>
+      </w:r>
+      <w:r>
+        <w:rPr>
+          <w:rStyle w:val="VerbatimChar"/>
+        </w:rPr>
+        <w:t xml:space="preserve">commission.archived_at</w:t>
+      </w:r>
+      <w:r>
+        <w:t xml:space="preserve"> </w:t>
+      </w:r>
+      <w:r>
+        <w:t xml:space="preserve">set) never count; lines on an archived</w:t>
+      </w:r>
+      <w:r>
+        <w:t xml:space="preserve"> </w:t>
+      </w:r>
+      <w:r>
+        <w:t xml:space="preserve">trip still do, as they do on the ledger, because the money was real.</w:t>
+      </w:r>
+    </w:p>
+    <w:p>
+      <w:pPr>
+        <w:pStyle w:val="BlockText"/>
+      </w:pPr>
+      <w:r>
+        <w:rPr>
+          <w:b/>
+          <w:bCs/>
+        </w:rPr>
+        <w:t xml:space="preserve">3.11.4 Top Destinations.</w:t>
+      </w:r>
+      <w:r>
+        <w:t xml:space="preserve"> </w:t>
+      </w:r>
+      <w:r>
+        <w:t xml:space="preserve">Counts booked, in-progress and completed trips; the period</w:t>
+      </w:r>
+      <w:r>
+        <w:t xml:space="preserve"> </w:t>
+      </w:r>
+      <w:r>
+        <w:t xml:space="preserve">filters on travel start date. A trip with several stops counts once in each place, and its</w:t>
+      </w:r>
+      <w:r>
+        <w:t xml:space="preserve"> </w:t>
+      </w:r>
+      <w:r>
+        <w:t xml:space="preserve">value is split evenly across them so the column still adds up to the trips’ total. Ranked</w:t>
+      </w:r>
+      <w:r>
+        <w:t xml:space="preserve"> </w:t>
+      </w:r>
+      <w:r>
+        <w:t xml:space="preserve">by value, with trip count.</w:t>
+      </w:r>
+      <w:r>
+        <w:t xml:space="preserve"> </w:t>
+      </w:r>
+      <w:r>
+        <w:rPr>
+          <w:b/>
+          <w:bCs/>
+        </w:rPr>
+        <w:t xml:space="preserve">No map:</w:t>
+      </w:r>
+      <w:r>
+        <w:t xml:space="preserve"> </w:t>
+      </w:r>
+      <w:r>
+        <w:t xml:space="preserve">the artboard’s pins sit on a stock photograph, and a</w:t>
+      </w:r>
+      <w:r>
+        <w:t xml:space="preserve"> </w:t>
+      </w:r>
+      <w:r>
+        <w:t xml:space="preserve">real map needs a tile provider (a new third-party service and a security review).</w:t>
+      </w:r>
+    </w:p>
+    <w:p>
+      <w:pPr>
+        <w:pStyle w:val="BlockText"/>
+      </w:pPr>
+      <w:r>
+        <w:rPr>
+          <w:b/>
+          <w:bCs/>
+        </w:rPr>
+        <w:t xml:space="preserve">3.11.5 Client Lifetime Value.</w:t>
+      </w:r>
+      <w:r>
+        <w:t xml:space="preserve"> </w:t>
+      </w:r>
+      <w:r>
+        <w:t xml:space="preserve">Lifetime value is the same expression Client Detail</w:t>
+      </w:r>
+      <w:r>
+        <w:t xml:space="preserve"> </w:t>
+      </w:r>
+      <w:r>
+        <w:t xml:space="preserve">already uses (the client’s committed trips), with a commission column beside it. Cohort is</w:t>
+      </w:r>
+      <w:r>
+        <w:t xml:space="preserve"> </w:t>
+      </w:r>
+      <w:r>
+        <w:t xml:space="preserve">the quarter of the client’s first booked trip, shown as a column and a filter. No cohort</w:t>
+      </w:r>
+      <w:r>
+        <w:t xml:space="preserve"> </w:t>
+      </w:r>
+      <w:r>
+        <w:t xml:space="preserve">grid. A row opens Client Detail.</w:t>
+      </w:r>
+      <w:r>
+        <w:t xml:space="preserve"> </w:t>
+      </w:r>
+      <w:r>
+        <w:rPr>
+          <w:rStyle w:val="VerbatimChar"/>
+        </w:rPr>
+        <w:t xml:space="preserve">client.lifetime_value_cents</w:t>
+      </w:r>
+      <w:r>
+        <w:t xml:space="preserve">, which nothing ever wrote,</w:t>
+      </w:r>
+      <w:r>
+        <w:t xml:space="preserve"> </w:t>
+      </w:r>
+      <w:r>
+        <w:t xml:space="preserve">is dropped (Data-Model §6.1).</w:t>
+      </w:r>
+    </w:p>
+    <w:p>
+      <w:pPr>
+        <w:pStyle w:val="BlockText"/>
+      </w:pPr>
+      <w:r>
+        <w:rPr>
+          <w:b/>
+          <w:bCs/>
+        </w:rPr>
+        <w:t xml:space="preserve">3.11.6 Conversion Funnel.</w:t>
+      </w:r>
+      <w:r>
+        <w:t xml:space="preserve"> </w:t>
+      </w:r>
+      <w:r>
+        <w:t xml:space="preserve">Stages</w:t>
+      </w:r>
+      <w:r>
+        <w:t xml:space="preserve"> </w:t>
+      </w:r>
+      <w:r>
+        <w:rPr>
+          <w:b/>
+          <w:bCs/>
+        </w:rPr>
+        <w:t xml:space="preserve">Inquiry → Proposal → Booked → Travelled</w:t>
+      </w:r>
+      <w:r>
+        <w:t xml:space="preserve">. There is no</w:t>
+      </w:r>
+      <w:r>
+        <w:t xml:space="preserve"> </w:t>
+      </w:r>
+      <w:r>
+        <w:t xml:space="preserve">Lead or Qualified stage: a quote request is a trip (decided 2026-09-09). The funnel follows</w:t>
+      </w:r>
+      <w:r>
+        <w:t xml:space="preserve"> </w:t>
+      </w:r>
+      <w:r>
+        <w:t xml:space="preserve">the trips CREATED in the period. A trip counts in every stage up to the furthest it reached,</w:t>
+      </w:r>
+      <w:r>
+        <w:t xml:space="preserve"> </w:t>
+      </w:r>
+      <w:r>
+        <w:t xml:space="preserve">so one entered straight as booked still counts as an inquiry. A cancelled trip is drop-off</w:t>
+      </w:r>
+      <w:r>
+        <w:t xml:space="preserve"> </w:t>
+      </w:r>
+      <w:r>
+        <w:t xml:space="preserve">at the stage it reached. Average days from inquiry to first booking shows here with its</w:t>
+      </w:r>
+      <w:r>
+        <w:t xml:space="preserve"> </w:t>
+      </w:r>
+      <w:r>
+        <w:t xml:space="preserve">sample size (the dashboard’s</w:t>
+      </w:r>
+      <w:r>
+        <w:t xml:space="preserve"> </w:t>
+      </w:r>
+      <w:r>
+        <w:rPr>
+          <w:rStyle w:val="VerbatimChar"/>
+        </w:rPr>
+        <w:t xml:space="preserve">inquiry_to_book_days</w:t>
+      </w:r>
+      <w:r>
+        <w:t xml:space="preserve">).</w:t>
+      </w:r>
+    </w:p>
+    <w:p>
+      <w:pPr>
+        <w:pStyle w:val="BlockText"/>
+      </w:pPr>
+      <w:r>
+        <w:rPr>
+          <w:b/>
+          <w:bCs/>
+        </w:rPr>
+        <w:t xml:space="preserve">3.11.7 Pipeline Value.</w:t>
+      </w:r>
+      <w:r>
+        <w:t xml:space="preserve"> </w:t>
+      </w:r>
+      <w:r>
+        <w:t xml:space="preserve">The artboard only repeats the funnel, so a local artboard is</w:t>
+      </w:r>
+      <w:r>
+        <w:t xml:space="preserve"> </w:t>
+      </w:r>
+      <w:r>
+        <w:t xml:space="preserve">drawn first. It shows open trips by stage, gross and weighted, and a forecast by expected</w:t>
+      </w:r>
+      <w:r>
+        <w:t xml:space="preserve"> </w:t>
+      </w:r>
+      <w:r>
+        <w:t xml:space="preserve">travel month.</w:t>
+      </w:r>
+      <w:r>
+        <w:t xml:space="preserve"> </w:t>
+      </w:r>
+      <w:r>
+        <w:t xml:space="preserve">“Adjust weighting”</w:t>
+      </w:r>
+      <w:r>
+        <w:t xml:space="preserve"> </w:t>
+      </w:r>
+      <w:r>
+        <w:t xml:space="preserve">edits the same</w:t>
+      </w:r>
+      <w:r>
+        <w:t xml:space="preserve"> </w:t>
+      </w:r>
+      <w:r>
+        <w:rPr>
+          <w:rStyle w:val="VerbatimChar"/>
+        </w:rPr>
+        <w:t xml:space="preserve">pipeline_weight</w:t>
+      </w:r>
+      <w:r>
+        <w:t xml:space="preserve"> </w:t>
+      </w:r>
+      <w:r>
+        <w:t xml:space="preserve">rows §3.7’s forecast</w:t>
+      </w:r>
+      <w:r>
+        <w:t xml:space="preserve"> </w:t>
+      </w:r>
+      <w:r>
+        <w:t xml:space="preserve">uses: one set of weights, not two.</w:t>
+      </w:r>
+    </w:p>
+    <w:p>
+      <w:pPr>
+        <w:pStyle w:val="BlockText"/>
+      </w:pPr>
+      <w:r>
+        <w:rPr>
+          <w:b/>
+          <w:bCs/>
+        </w:rPr>
+        <w:t xml:space="preserve">3.11.8 Export Center.</w:t>
+      </w:r>
+      <w:r>
+        <w:t xml:space="preserve"> </w:t>
+      </w:r>
+      <w:r>
+        <w:rPr>
+          <w:b/>
+          <w:bCs/>
+        </w:rPr>
+        <w:t xml:space="preserve">CSV only:</w:t>
+      </w:r>
+      <w:r>
+        <w:t xml:space="preserve"> </w:t>
+      </w:r>
+      <w:r>
+        <w:t xml:space="preserve">Excel opens it, and a real</w:t>
+      </w:r>
+      <w:r>
+        <w:t xml:space="preserve"> </w:t>
+      </w:r>
+      <w:r>
+        <w:rPr>
+          <w:rStyle w:val="VerbatimChar"/>
+        </w:rPr>
+        <w:t xml:space="preserve">.xlsx</w:t>
+      </w:r>
+      <w:r>
+        <w:t xml:space="preserve"> </w:t>
+      </w:r>
+      <w:r>
+        <w:t xml:space="preserve">needs a new</w:t>
+      </w:r>
+      <w:r>
+        <w:t xml:space="preserve"> </w:t>
+      </w:r>
+      <w:r>
+        <w:t xml:space="preserve">library and a review. Files are built on demand and downloaded at once, so no client data</w:t>
+      </w:r>
+      <w:r>
+        <w:t xml:space="preserve"> </w:t>
+      </w:r>
+      <w:r>
+        <w:t xml:space="preserve">sits in a bucket.</w:t>
+      </w:r>
+      <w:r>
+        <w:t xml:space="preserve"> </w:t>
+      </w:r>
+      <w:r>
+        <w:rPr>
+          <w:b/>
+          <w:bCs/>
+        </w:rPr>
+        <w:t xml:space="preserve">Recent exports</w:t>
+      </w:r>
+      <w:r>
+        <w:t xml:space="preserve"> </w:t>
+      </w:r>
+      <w:r>
+        <w:t xml:space="preserve">are read from the</w:t>
+      </w:r>
+      <w:r>
+        <w:t xml:space="preserve"> </w:t>
+      </w:r>
+      <w:r>
+        <w:rPr>
+          <w:rStyle w:val="VerbatimChar"/>
+        </w:rPr>
+        <w:t xml:space="preserve">audit_event</w:t>
+      </w:r>
+      <w:r>
+        <w:t xml:space="preserve"> </w:t>
+      </w:r>
+      <w:r>
+        <w:t xml:space="preserve">rows every export</w:t>
+      </w:r>
+      <w:r>
+        <w:t xml:space="preserve"> </w:t>
+      </w:r>
+      <w:r>
+        <w:t xml:space="preserve">already writes;</w:t>
+      </w:r>
+      <w:r>
+        <w:t xml:space="preserve"> </w:t>
+      </w:r>
+      <w:r>
+        <w:t xml:space="preserve">“Run again”</w:t>
+      </w:r>
+      <w:r>
+        <w:t xml:space="preserve"> </w:t>
+      </w:r>
+      <w:r>
+        <w:t xml:space="preserve">repeats one with the same settings. Nothing expires. Four types:</w:t>
+      </w:r>
+      <w:r>
+        <w:t xml:space="preserve"> </w:t>
+      </w:r>
+      <w:r>
+        <w:rPr>
+          <w:b/>
+          <w:bCs/>
+        </w:rPr>
+        <w:t xml:space="preserve">Commission ledger</w:t>
+      </w:r>
+      <w:r>
+        <w:t xml:space="preserve">,</w:t>
+      </w:r>
+      <w:r>
+        <w:t xml:space="preserve"> </w:t>
+      </w:r>
+      <w:r>
+        <w:rPr>
+          <w:b/>
+          <w:bCs/>
+        </w:rPr>
+        <w:t xml:space="preserve">Trips</w:t>
+      </w:r>
+      <w:r>
+        <w:t xml:space="preserve"> </w:t>
+      </w:r>
+      <w:r>
+        <w:t xml:space="preserve">(dates, stage, value, commission),</w:t>
+      </w:r>
+      <w:r>
+        <w:t xml:space="preserve"> </w:t>
+      </w:r>
+      <w:r>
+        <w:rPr>
+          <w:b/>
+          <w:bCs/>
+        </w:rPr>
+        <w:t xml:space="preserve">Payment milestones</w:t>
+      </w:r>
+      <w:r>
+        <w:t xml:space="preserve"> </w:t>
+      </w:r>
+      <w:r>
+        <w:t xml:space="preserve">(the supplier pay schedule, paid or not) and</w:t>
+      </w:r>
+      <w:r>
+        <w:t xml:space="preserve"> </w:t>
+      </w:r>
+      <w:r>
+        <w:rPr>
+          <w:b/>
+          <w:bCs/>
+        </w:rPr>
+        <w:t xml:space="preserve">Clients</w:t>
+      </w:r>
+      <w:r>
+        <w:t xml:space="preserve">. A Clients export carries contact</w:t>
+      </w:r>
+      <w:r>
+        <w:t xml:space="preserve"> </w:t>
+      </w:r>
+      <w:r>
+        <w:t xml:space="preserve">details (email, phone, mailing address) only when</w:t>
+      </w:r>
+      <w:r>
+        <w:t xml:space="preserve"> </w:t>
+      </w:r>
+      <w:r>
+        <w:t xml:space="preserve">“Include contact details”</w:t>
+      </w:r>
+      <w:r>
+        <w:t xml:space="preserve"> </w:t>
+      </w:r>
+      <w:r>
+        <w:t xml:space="preserve">is checked; it</w:t>
+      </w:r>
+      <w:r>
+        <w:t xml:space="preserve"> </w:t>
+      </w:r>
+      <w:r>
+        <w:t xml:space="preserve">starts unchecked. Every export is audited.</w:t>
       </w:r>
     </w:p>
     <w:bookmarkStart w:id="192" w:name="reports-hub"/>

</xml_diff>

<commit_message>
fix(P2): lead 400s speak to whoever reads them; "New note" push title
Brand-voice review of the §3.8 copy. The shared lead parsers served both
the public form and the advisor's Add lead / Close, so Gyasi was told
"Please tell Gyasi your first name." Each sentence now has a visitor and
an advisor voice. The visitor's card refusal covers the phone field too,
an over-long note says the limit, and a lead's push reads "New note
from ..." so a stranger's note never looks like a client's message.
Screen Inventory 2.0.12: the form's privacy line is widened for accuracy.

Co-Authored-By: Claude Opus 5.5 <noreply@anthropic.com>
</commit_message>
<xml_diff>
--- a/docs/Screen-Inventory.docx
+++ b/docs/Screen-Inventory.docx
@@ -3550,10 +3550,109 @@
         <w:t xml:space="preserve"> </w:t>
       </w:r>
       <w:r>
-        <w:t xml:space="preserve">only use this to reply to you”</w:t>
-      </w:r>
-      <w:r>
-        <w:t xml:space="preserve">, linked to the Privacy page; no consent checkbox. After sending,</w:t>
+        <w:t xml:space="preserve">only use this to get back to you and see where people find us”</w:t>
+      </w:r>
+      <w:r>
+        <w:t xml:space="preserve">, linked to the Privacy page; no</w:t>
+      </w:r>
+      <w:r>
+        <w:t xml:space="preserve"> </w:t>
+      </w:r>
+      <w:r>
+        <w:t xml:space="preserve">consent checkbox.</w:t>
+      </w:r>
+      <w:r>
+        <w:t xml:space="preserve"> </w:t>
+      </w:r>
+      <w:r>
+        <w:rPr>
+          <w:i/>
+          <w:iCs/>
+        </w:rPr>
+        <w:t xml:space="preserve">(The ruled wording was</w:t>
+      </w:r>
+      <w:r>
+        <w:rPr>
+          <w:i/>
+          <w:iCs/>
+        </w:rPr>
+        <w:t xml:space="preserve"> </w:t>
+      </w:r>
+      <w:r>
+        <w:rPr>
+          <w:i/>
+          <w:iCs/>
+        </w:rPr>
+        <w:t xml:space="preserve">“Gyasi will only use this to reply to you”</w:t>
+      </w:r>
+      <w:r>
+        <w:rPr>
+          <w:i/>
+          <w:iCs/>
+        </w:rPr>
+        <w:t xml:space="preserve">; the</w:t>
+      </w:r>
+      <w:r>
+        <w:rPr>
+          <w:i/>
+          <w:iCs/>
+        </w:rPr>
+        <w:t xml:space="preserve"> </w:t>
+      </w:r>
+      <w:r>
+        <w:rPr>
+          <w:i/>
+          <w:iCs/>
+        </w:rPr>
+        <w:t xml:space="preserve">brand-voice review on 2026-10-21 widened it, because the page, the trip or topic and the</w:t>
+      </w:r>
+      <w:r>
+        <w:rPr>
+          <w:i/>
+          <w:iCs/>
+        </w:rPr>
+        <w:t xml:space="preserve"> </w:t>
+      </w:r>
+      <w:r>
+        <w:rPr>
+          <w:i/>
+          <w:iCs/>
+        </w:rPr>
+        <w:t xml:space="preserve">campaign tag are also kept for 3.11.9, and</w:t>
+      </w:r>
+      <w:r>
+        <w:rPr>
+          <w:i/>
+          <w:iCs/>
+        </w:rPr>
+        <w:t xml:space="preserve"> </w:t>
+      </w:r>
+      <w:r>
+        <w:rPr>
+          <w:i/>
+          <w:iCs/>
+        </w:rPr>
+        <w:t xml:space="preserve">“only to reply”</w:t>
+      </w:r>
+      <w:r>
+        <w:rPr>
+          <w:i/>
+          <w:iCs/>
+        </w:rPr>
+        <w:t xml:space="preserve"> </w:t>
+      </w:r>
+      <w:r>
+        <w:rPr>
+          <w:i/>
+          <w:iCs/>
+        </w:rPr>
+        <w:t xml:space="preserve">would be untrue.)</w:t>
+      </w:r>
+      <w:r>
+        <w:t xml:space="preserve"> </w:t>
+      </w:r>
+      <w:r>
+        <w:t xml:space="preserve">After sending,</w:t>
       </w:r>
       <w:r>
         <w:t xml:space="preserve"> </w:t>

</xml_diff>